<commit_message>
v7.4.1: Server-seitige User-Erstellung via API-Route
</commit_message>
<xml_diff>
--- a/downloads/PZE_Schnellstart_Firmen-Administrator_v2.docx
+++ b/downloads/PZE_Schnellstart_Firmen-Administrator_v2.docx
@@ -24,12 +24,6 @@
         <w:gridCol w:w="3000"/>
       </w:tblGrid>
       <w:tr>
-        <w:tblPrEx>
-          <w:tblCellMar>
-            <w:top w:w="0" w:type="dxa"/>
-            <w:bottom w:w="0" w:type="dxa"/>
-          </w:tblCellMar>
-        </w:tblPrEx>
         <w:tc>
           <w:tcPr>
             <w:tcW w:w="7106" w:type="dxa"/>
@@ -151,12 +145,6 @@
         <w:gridCol w:w="10106"/>
       </w:tblGrid>
       <w:tr>
-        <w:tblPrEx>
-          <w:tblCellMar>
-            <w:top w:w="0" w:type="dxa"/>
-            <w:bottom w:w="0" w:type="dxa"/>
-          </w:tblCellMar>
-        </w:tblPrEx>
         <w:tc>
           <w:tcPr>
             <w:tcW w:w="0" w:type="auto"/>
@@ -213,12 +201,6 @@
         <w:gridCol w:w="10106"/>
       </w:tblGrid>
       <w:tr>
-        <w:tblPrEx>
-          <w:tblCellMar>
-            <w:top w:w="0" w:type="dxa"/>
-            <w:bottom w:w="0" w:type="dxa"/>
-          </w:tblCellMar>
-        </w:tblPrEx>
         <w:tc>
           <w:tcPr>
             <w:tcW w:w="0" w:type="auto"/>
@@ -325,12 +307,6 @@
         <w:gridCol w:w="1700"/>
       </w:tblGrid>
       <w:tr>
-        <w:tblPrEx>
-          <w:tblCellMar>
-            <w:top w:w="0" w:type="dxa"/>
-            <w:bottom w:w="0" w:type="dxa"/>
-          </w:tblCellMar>
-        </w:tblPrEx>
         <w:tc>
           <w:tcPr>
             <w:tcW w:w="1700" w:type="dxa"/>
@@ -537,12 +513,6 @@
         </w:tc>
       </w:tr>
       <w:tr>
-        <w:tblPrEx>
-          <w:tblCellMar>
-            <w:top w:w="0" w:type="dxa"/>
-            <w:bottom w:w="0" w:type="dxa"/>
-          </w:tblCellMar>
-        </w:tblPrEx>
         <w:tc>
           <w:tcPr>
             <w:tcW w:w="1700" w:type="dxa"/>
@@ -775,12 +745,6 @@
         <w:gridCol w:w="7506"/>
       </w:tblGrid>
       <w:tr>
-        <w:tblPrEx>
-          <w:tblCellMar>
-            <w:top w:w="0" w:type="dxa"/>
-            <w:bottom w:w="0" w:type="dxa"/>
-          </w:tblCellMar>
-        </w:tblPrEx>
         <w:tc>
           <w:tcPr>
             <w:tcW w:w="2600" w:type="dxa"/>
@@ -842,12 +806,6 @@
         </w:tc>
       </w:tr>
       <w:tr>
-        <w:tblPrEx>
-          <w:tblCellMar>
-            <w:top w:w="0" w:type="dxa"/>
-            <w:bottom w:w="0" w:type="dxa"/>
-          </w:tblCellMar>
-        </w:tblPrEx>
         <w:tc>
           <w:tcPr>
             <w:tcW w:w="2600" w:type="dxa"/>
@@ -909,12 +867,6 @@
         </w:tc>
       </w:tr>
       <w:tr>
-        <w:tblPrEx>
-          <w:tblCellMar>
-            <w:top w:w="0" w:type="dxa"/>
-            <w:bottom w:w="0" w:type="dxa"/>
-          </w:tblCellMar>
-        </w:tblPrEx>
         <w:tc>
           <w:tcPr>
             <w:tcW w:w="2600" w:type="dxa"/>
@@ -1039,12 +991,6 @@
         <w:gridCol w:w="8306"/>
       </w:tblGrid>
       <w:tr>
-        <w:tblPrEx>
-          <w:tblCellMar>
-            <w:top w:w="0" w:type="dxa"/>
-            <w:bottom w:w="0" w:type="dxa"/>
-          </w:tblCellMar>
-        </w:tblPrEx>
         <w:tc>
           <w:tcPr>
             <w:tcW w:w="400" w:type="dxa"/>
@@ -1125,12 +1071,6 @@
         </w:tc>
       </w:tr>
       <w:tr>
-        <w:tblPrEx>
-          <w:tblCellMar>
-            <w:top w:w="0" w:type="dxa"/>
-            <w:bottom w:w="0" w:type="dxa"/>
-          </w:tblCellMar>
-        </w:tblPrEx>
         <w:tc>
           <w:tcPr>
             <w:tcW w:w="400" w:type="dxa"/>
@@ -1211,12 +1151,6 @@
         </w:tc>
       </w:tr>
       <w:tr>
-        <w:tblPrEx>
-          <w:tblCellMar>
-            <w:top w:w="0" w:type="dxa"/>
-            <w:bottom w:w="0" w:type="dxa"/>
-          </w:tblCellMar>
-        </w:tblPrEx>
         <w:tc>
           <w:tcPr>
             <w:tcW w:w="400" w:type="dxa"/>
@@ -1297,12 +1231,6 @@
         </w:tc>
       </w:tr>
       <w:tr>
-        <w:tblPrEx>
-          <w:tblCellMar>
-            <w:top w:w="0" w:type="dxa"/>
-            <w:bottom w:w="0" w:type="dxa"/>
-          </w:tblCellMar>
-        </w:tblPrEx>
         <w:tc>
           <w:tcPr>
             <w:tcW w:w="400" w:type="dxa"/>
@@ -1457,12 +1385,6 @@
         <w:gridCol w:w="9706"/>
       </w:tblGrid>
       <w:tr>
-        <w:tblPrEx>
-          <w:tblCellMar>
-            <w:top w:w="0" w:type="dxa"/>
-            <w:bottom w:w="0" w:type="dxa"/>
-          </w:tblCellMar>
-        </w:tblPrEx>
         <w:tc>
           <w:tcPr>
             <w:tcW w:w="400" w:type="dxa"/>
@@ -1529,12 +1451,6 @@
         </w:tc>
       </w:tr>
       <w:tr>
-        <w:tblPrEx>
-          <w:tblCellMar>
-            <w:top w:w="0" w:type="dxa"/>
-            <w:bottom w:w="0" w:type="dxa"/>
-          </w:tblCellMar>
-        </w:tblPrEx>
         <w:tc>
           <w:tcPr>
             <w:tcW w:w="400" w:type="dxa"/>
@@ -1629,12 +1545,6 @@
         </w:tc>
       </w:tr>
       <w:tr>
-        <w:tblPrEx>
-          <w:tblCellMar>
-            <w:top w:w="0" w:type="dxa"/>
-            <w:bottom w:w="0" w:type="dxa"/>
-          </w:tblCellMar>
-        </w:tblPrEx>
         <w:tc>
           <w:tcPr>
             <w:tcW w:w="400" w:type="dxa"/>
@@ -1755,12 +1665,6 @@
         <w:gridCol w:w="10106"/>
       </w:tblGrid>
       <w:tr>
-        <w:tblPrEx>
-          <w:tblCellMar>
-            <w:top w:w="0" w:type="dxa"/>
-            <w:bottom w:w="0" w:type="dxa"/>
-          </w:tblCellMar>
-        </w:tblPrEx>
         <w:tc>
           <w:tcPr>
             <w:tcW w:w="0" w:type="auto"/>
@@ -1885,12 +1789,6 @@
         <w:gridCol w:w="9706"/>
       </w:tblGrid>
       <w:tr>
-        <w:tblPrEx>
-          <w:tblCellMar>
-            <w:top w:w="0" w:type="dxa"/>
-            <w:bottom w:w="0" w:type="dxa"/>
-          </w:tblCellMar>
-        </w:tblPrEx>
         <w:tc>
           <w:tcPr>
             <w:tcW w:w="400" w:type="dxa"/>
@@ -1985,12 +1883,6 @@
         </w:tc>
       </w:tr>
       <w:tr>
-        <w:tblPrEx>
-          <w:tblCellMar>
-            <w:top w:w="0" w:type="dxa"/>
-            <w:bottom w:w="0" w:type="dxa"/>
-          </w:tblCellMar>
-        </w:tblPrEx>
         <w:tc>
           <w:tcPr>
             <w:tcW w:w="400" w:type="dxa"/>
@@ -2057,12 +1949,6 @@
         </w:tc>
       </w:tr>
       <w:tr>
-        <w:tblPrEx>
-          <w:tblCellMar>
-            <w:top w:w="0" w:type="dxa"/>
-            <w:bottom w:w="0" w:type="dxa"/>
-          </w:tblCellMar>
-        </w:tblPrEx>
         <w:tc>
           <w:tcPr>
             <w:tcW w:w="400" w:type="dxa"/>
@@ -2157,12 +2043,6 @@
         </w:tc>
       </w:tr>
       <w:tr>
-        <w:tblPrEx>
-          <w:tblCellMar>
-            <w:top w:w="0" w:type="dxa"/>
-            <w:bottom w:w="0" w:type="dxa"/>
-          </w:tblCellMar>
-        </w:tblPrEx>
         <w:tc>
           <w:tcPr>
             <w:tcW w:w="400" w:type="dxa"/>
@@ -2257,12 +2137,6 @@
         </w:tc>
       </w:tr>
       <w:tr>
-        <w:tblPrEx>
-          <w:tblCellMar>
-            <w:top w:w="0" w:type="dxa"/>
-            <w:bottom w:w="0" w:type="dxa"/>
-          </w:tblCellMar>
-        </w:tblPrEx>
         <w:tc>
           <w:tcPr>
             <w:tcW w:w="400" w:type="dxa"/>
@@ -2355,12 +2229,6 @@
         <w:gridCol w:w="10106"/>
       </w:tblGrid>
       <w:tr>
-        <w:tblPrEx>
-          <w:tblCellMar>
-            <w:top w:w="0" w:type="dxa"/>
-            <w:bottom w:w="0" w:type="dxa"/>
-          </w:tblCellMar>
-        </w:tblPrEx>
         <w:tc>
           <w:tcPr>
             <w:tcW w:w="0" w:type="auto"/>
@@ -2473,12 +2341,6 @@
         <w:gridCol w:w="10106"/>
       </w:tblGrid>
       <w:tr>
-        <w:tblPrEx>
-          <w:tblCellMar>
-            <w:top w:w="0" w:type="dxa"/>
-            <w:bottom w:w="0" w:type="dxa"/>
-          </w:tblCellMar>
-        </w:tblPrEx>
         <w:tc>
           <w:tcPr>
             <w:tcW w:w="0" w:type="auto"/>
@@ -2590,12 +2452,6 @@
         <w:gridCol w:w="9706"/>
       </w:tblGrid>
       <w:tr>
-        <w:tblPrEx>
-          <w:tblCellMar>
-            <w:top w:w="0" w:type="dxa"/>
-            <w:bottom w:w="0" w:type="dxa"/>
-          </w:tblCellMar>
-        </w:tblPrEx>
         <w:tc>
           <w:tcPr>
             <w:tcW w:w="400" w:type="dxa"/>
@@ -2690,12 +2546,6 @@
         </w:tc>
       </w:tr>
       <w:tr>
-        <w:tblPrEx>
-          <w:tblCellMar>
-            <w:top w:w="0" w:type="dxa"/>
-            <w:bottom w:w="0" w:type="dxa"/>
-          </w:tblCellMar>
-        </w:tblPrEx>
         <w:tc>
           <w:tcPr>
             <w:tcW w:w="400" w:type="dxa"/>
@@ -2790,12 +2640,6 @@
         </w:tc>
       </w:tr>
       <w:tr>
-        <w:tblPrEx>
-          <w:tblCellMar>
-            <w:top w:w="0" w:type="dxa"/>
-            <w:bottom w:w="0" w:type="dxa"/>
-          </w:tblCellMar>
-        </w:tblPrEx>
         <w:tc>
           <w:tcPr>
             <w:tcW w:w="400" w:type="dxa"/>
@@ -2951,12 +2795,6 @@
         <w:gridCol w:w="9706"/>
       </w:tblGrid>
       <w:tr>
-        <w:tblPrEx>
-          <w:tblCellMar>
-            <w:top w:w="0" w:type="dxa"/>
-            <w:bottom w:w="0" w:type="dxa"/>
-          </w:tblCellMar>
-        </w:tblPrEx>
         <w:tc>
           <w:tcPr>
             <w:tcW w:w="400" w:type="dxa"/>
@@ -3023,12 +2861,6 @@
         </w:tc>
       </w:tr>
       <w:tr>
-        <w:tblPrEx>
-          <w:tblCellMar>
-            <w:top w:w="0" w:type="dxa"/>
-            <w:bottom w:w="0" w:type="dxa"/>
-          </w:tblCellMar>
-        </w:tblPrEx>
         <w:tc>
           <w:tcPr>
             <w:tcW w:w="400" w:type="dxa"/>
@@ -3095,12 +2927,6 @@
         </w:tc>
       </w:tr>
       <w:tr>
-        <w:tblPrEx>
-          <w:tblCellMar>
-            <w:top w:w="0" w:type="dxa"/>
-            <w:bottom w:w="0" w:type="dxa"/>
-          </w:tblCellMar>
-        </w:tblPrEx>
         <w:tc>
           <w:tcPr>
             <w:tcW w:w="400" w:type="dxa"/>
@@ -3195,12 +3021,6 @@
         </w:tc>
       </w:tr>
       <w:tr>
-        <w:tblPrEx>
-          <w:tblCellMar>
-            <w:top w:w="0" w:type="dxa"/>
-            <w:bottom w:w="0" w:type="dxa"/>
-          </w:tblCellMar>
-        </w:tblPrEx>
         <w:tc>
           <w:tcPr>
             <w:tcW w:w="400" w:type="dxa"/>
@@ -3267,12 +3087,6 @@
         </w:tc>
       </w:tr>
       <w:tr>
-        <w:tblPrEx>
-          <w:tblCellMar>
-            <w:top w:w="0" w:type="dxa"/>
-            <w:bottom w:w="0" w:type="dxa"/>
-          </w:tblCellMar>
-        </w:tblPrEx>
         <w:tc>
           <w:tcPr>
             <w:tcW w:w="400" w:type="dxa"/>
@@ -3428,12 +3242,6 @@
         <w:gridCol w:w="9706"/>
       </w:tblGrid>
       <w:tr>
-        <w:tblPrEx>
-          <w:tblCellMar>
-            <w:top w:w="0" w:type="dxa"/>
-            <w:bottom w:w="0" w:type="dxa"/>
-          </w:tblCellMar>
-        </w:tblPrEx>
         <w:tc>
           <w:tcPr>
             <w:tcW w:w="400" w:type="dxa"/>
@@ -3528,12 +3336,6 @@
         </w:tc>
       </w:tr>
       <w:tr>
-        <w:tblPrEx>
-          <w:tblCellMar>
-            <w:top w:w="0" w:type="dxa"/>
-            <w:bottom w:w="0" w:type="dxa"/>
-          </w:tblCellMar>
-        </w:tblPrEx>
         <w:tc>
           <w:tcPr>
             <w:tcW w:w="400" w:type="dxa"/>
@@ -3600,12 +3402,6 @@
         </w:tc>
       </w:tr>
       <w:tr>
-        <w:tblPrEx>
-          <w:tblCellMar>
-            <w:top w:w="0" w:type="dxa"/>
-            <w:bottom w:w="0" w:type="dxa"/>
-          </w:tblCellMar>
-        </w:tblPrEx>
         <w:tc>
           <w:tcPr>
             <w:tcW w:w="400" w:type="dxa"/>
@@ -3700,12 +3496,6 @@
         </w:tc>
       </w:tr>
       <w:tr>
-        <w:tblPrEx>
-          <w:tblCellMar>
-            <w:top w:w="0" w:type="dxa"/>
-            <w:bottom w:w="0" w:type="dxa"/>
-          </w:tblCellMar>
-        </w:tblPrEx>
         <w:tc>
           <w:tcPr>
             <w:tcW w:w="400" w:type="dxa"/>
@@ -3794,18 +3584,28 @@
                 <w:sz w:val="16"/>
                 <w:szCs w:val="16"/>
               </w:rPr>
-              <w:t>gemäß Arbeitsplan)</w:t>
+              <w:t xml:space="preserve">gemäß </w:t>
+            </w:r>
+            <w:r>
+              <w:rPr>
+                <w:color w:val="6B7280"/>
+                <w:sz w:val="16"/>
+                <w:szCs w:val="16"/>
+              </w:rPr>
+              <w:t>Anlage 6.1 des Förderantrags</w:t>
+            </w:r>
+            <w:r>
+              <w:rPr>
+                <w:color w:val="6B7280"/>
+                <w:sz w:val="16"/>
+                <w:szCs w:val="16"/>
+              </w:rPr>
+              <w:t>)</w:t>
             </w:r>
           </w:p>
         </w:tc>
       </w:tr>
       <w:tr>
-        <w:tblPrEx>
-          <w:tblCellMar>
-            <w:top w:w="0" w:type="dxa"/>
-            <w:bottom w:w="0" w:type="dxa"/>
-          </w:tblCellMar>
-        </w:tblPrEx>
         <w:tc>
           <w:tcPr>
             <w:tcW w:w="400" w:type="dxa"/>
@@ -3931,12 +3731,6 @@
         <w:gridCol w:w="10106"/>
       </w:tblGrid>
       <w:tr>
-        <w:tblPrEx>
-          <w:tblCellMar>
-            <w:top w:w="0" w:type="dxa"/>
-            <w:bottom w:w="0" w:type="dxa"/>
-          </w:tblCellMar>
-        </w:tblPrEx>
         <w:tc>
           <w:tcPr>
             <w:tcW w:w="0" w:type="auto"/>
@@ -3969,12 +3763,6 @@
         </w:tc>
       </w:tr>
       <w:tr>
-        <w:tblPrEx>
-          <w:tblCellMar>
-            <w:top w:w="0" w:type="dxa"/>
-            <w:bottom w:w="0" w:type="dxa"/>
-          </w:tblCellMar>
-        </w:tblPrEx>
         <w:tc>
           <w:tcPr>
             <w:tcW w:w="0" w:type="auto"/>

</xml_diff>